<commit_message>
Bestellvorlage lesbarer und reproduzierbar gestaltet
</commit_message>
<xml_diff>
--- a/beispiele/business/C-Bestellvorschlag/vorlagen/Bestellung.docx
+++ b/beispiele/business/C-Bestellvorschlag/vorlagen/Bestellung.docx
@@ -16,36 +16,91 @@
     </w:p>
     <w:p>
       <w:r>
-        <w:t>Synthetisches Beispiel · keine Bestellung an einen echten Lieferanten</w:t>
+        <w:t>Zur fachlichen Prüfung vor einer Bestellung</w:t>
       </w:r>
     </w:p>
     <w:p>
+      <w:pPr>
+        <w:pStyle w:val="Bestellangaben"/>
+      </w:pPr>
       <w:r>
-        <w:t>Lieferant: {{Lieferant}}</w:t>
+        <w:rPr>
+          <w:b/>
+        </w:rPr>
+        <w:t xml:space="preserve">Lieferant: </w:t>
+      </w:r>
+      <w:r>
+        <w:t>{{Lieferant}}</w:t>
       </w:r>
     </w:p>
     <w:p>
+      <w:pPr>
+        <w:pStyle w:val="Bestellangaben"/>
+      </w:pPr>
       <w:r>
-        <w:t>Bestelldatum: {{Datum}}</w:t>
+        <w:rPr>
+          <w:b/>
+        </w:rPr>
+        <w:t xml:space="preserve">Bestelldatum: </w:t>
+      </w:r>
+      <w:r>
+        <w:t>{{Datum}}</w:t>
+      </w:r>
+    </w:p>
+    <w:p>
+      <w:pPr>
+        <w:pStyle w:val="Heading2"/>
+      </w:pPr>
+      <w:r>
+        <w:t>Bestellpositionen</w:t>
+      </w:r>
+    </w:p>
+    <w:p>
+      <w:pPr>
+        <w:keepNext/>
+        <w:spacing w:after="160"/>
+      </w:pPr>
+      <w:r>
+        <w:t>Alle Mengen in Stück. Die Bestellmenge ergänzt den Bestand auf den Zielbestand.</w:t>
       </w:r>
     </w:p>
     <w:tbl>
       <w:tblPr>
         <w:tblW w:type="auto" w:w="0"/>
+        <w:jc w:val="left"/>
         <w:tblLayout w:type="fixed"/>
         <w:tblLook w:firstColumn="1" w:firstRow="1" w:lastColumn="0" w:lastRow="0" w:noHBand="0" w:noVBand="1" w:val="04A0"/>
+        <w:tblBorders>
+          <w:top w:val="single" w:sz="4" w:color="D9D9D9"/>
+          <w:left w:val="single" w:sz="4" w:color="D9D9D9"/>
+          <w:bottom w:val="single" w:sz="4" w:color="D9D9D9"/>
+          <w:right w:val="single" w:sz="4" w:color="D9D9D9"/>
+          <w:insideH w:val="single" w:sz="4" w:color="D9D9D9"/>
+          <w:insideV w:val="single" w:sz="4" w:color="D9D9D9"/>
+        </w:tblBorders>
       </w:tblPr>
       <w:tblGrid>
-        <w:gridCol w:w="3744"/>
-        <w:gridCol w:w="1440"/>
-        <w:gridCol w:w="2016"/>
-        <w:gridCol w:w="2160"/>
+        <w:gridCol w:w="2211"/>
+        <w:gridCol w:w="2154"/>
+        <w:gridCol w:w="2551"/>
+        <w:gridCol w:w="2721"/>
       </w:tblGrid>
       <w:tr>
+        <w:trPr>
+          <w:cantSplit/>
+          <w:tblHeader/>
+        </w:trPr>
         <w:tc>
           <w:tcPr>
-            <w:tcW w:type="dxa" w:w="2340"/>
-            <w:shd w:fill="243F59"/>
+            <w:tcW w:type="dxa" w:w="2211"/>
+            <w:vAlign w:val="center"/>
+            <w:tcMar>
+              <w:top w:w="90" w:type="dxa"/>
+              <w:bottom w:w="90" w:type="dxa"/>
+              <w:left w:w="110" w:type="dxa"/>
+              <w:right w:w="110" w:type="dxa"/>
+            </w:tcMar>
+            <w:shd w:fill="EDF0F0"/>
             <w:tcBorders>
               <w:top w:val="single" w:sz="4" w:color="D9D9D9"/>
               <w:left w:val="single" w:sz="4" w:color="D9D9D9"/>
@@ -54,10 +109,16 @@
             </w:tcBorders>
           </w:tcPr>
           <w:p>
+            <w:pPr>
+              <w:spacing w:before="0" w:after="0" w:line="276" w:lineRule="auto"/>
+              <w:jc w:val="left"/>
+            </w:pPr>
             <w:r>
               <w:rPr>
+                <w:rFonts w:ascii="Segoe UI" w:hAnsi="Segoe UI"/>
                 <w:b/>
-                <w:color w:val="FFFFFF"/>
+                <w:color w:val="000000"/>
+                <w:sz w:val="22"/>
               </w:rPr>
               <w:t>Artikel</w:t>
             </w:r>
@@ -65,8 +126,15 @@
         </w:tc>
         <w:tc>
           <w:tcPr>
-            <w:tcW w:type="dxa" w:w="2340"/>
-            <w:shd w:fill="243F59"/>
+            <w:tcW w:type="dxa" w:w="2154"/>
+            <w:vAlign w:val="center"/>
+            <w:tcMar>
+              <w:top w:w="90" w:type="dxa"/>
+              <w:bottom w:w="90" w:type="dxa"/>
+              <w:left w:w="110" w:type="dxa"/>
+              <w:right w:w="110" w:type="dxa"/>
+            </w:tcMar>
+            <w:shd w:fill="EDF0F0"/>
             <w:tcBorders>
               <w:top w:val="single" w:sz="4" w:color="D9D9D9"/>
               <w:left w:val="single" w:sz="4" w:color="D9D9D9"/>
@@ -75,10 +143,16 @@
             </w:tcBorders>
           </w:tcPr>
           <w:p>
+            <w:pPr>
+              <w:spacing w:before="0" w:after="0" w:line="276" w:lineRule="auto"/>
+              <w:jc w:val="right"/>
+            </w:pPr>
             <w:r>
               <w:rPr>
+                <w:rFonts w:ascii="Segoe UI" w:hAnsi="Segoe UI"/>
                 <w:b/>
-                <w:color w:val="FFFFFF"/>
+                <w:color w:val="000000"/>
+                <w:sz w:val="22"/>
               </w:rPr>
               <w:t>Bestand</w:t>
             </w:r>
@@ -86,8 +160,15 @@
         </w:tc>
         <w:tc>
           <w:tcPr>
-            <w:tcW w:type="dxa" w:w="2340"/>
-            <w:shd w:fill="243F59"/>
+            <w:tcW w:type="dxa" w:w="2551"/>
+            <w:vAlign w:val="center"/>
+            <w:tcMar>
+              <w:top w:w="90" w:type="dxa"/>
+              <w:bottom w:w="90" w:type="dxa"/>
+              <w:left w:w="110" w:type="dxa"/>
+              <w:right w:w="110" w:type="dxa"/>
+            </w:tcMar>
+            <w:shd w:fill="EDF0F0"/>
             <w:tcBorders>
               <w:top w:val="single" w:sz="4" w:color="D9D9D9"/>
               <w:left w:val="single" w:sz="4" w:color="D9D9D9"/>
@@ -96,10 +177,16 @@
             </w:tcBorders>
           </w:tcPr>
           <w:p>
+            <w:pPr>
+              <w:spacing w:before="0" w:after="0" w:line="276" w:lineRule="auto"/>
+              <w:jc w:val="right"/>
+            </w:pPr>
             <w:r>
               <w:rPr>
+                <w:rFonts w:ascii="Segoe UI" w:hAnsi="Segoe UI"/>
                 <w:b/>
-                <w:color w:val="FFFFFF"/>
+                <w:color w:val="000000"/>
+                <w:sz w:val="22"/>
               </w:rPr>
               <w:t>Zielbestand</w:t>
             </w:r>
@@ -107,8 +194,15 @@
         </w:tc>
         <w:tc>
           <w:tcPr>
-            <w:tcW w:type="dxa" w:w="2340"/>
-            <w:shd w:fill="243F59"/>
+            <w:tcW w:type="dxa" w:w="2721"/>
+            <w:vAlign w:val="center"/>
+            <w:tcMar>
+              <w:top w:w="90" w:type="dxa"/>
+              <w:bottom w:w="90" w:type="dxa"/>
+              <w:left w:w="110" w:type="dxa"/>
+              <w:right w:w="110" w:type="dxa"/>
+            </w:tcMar>
+            <w:shd w:fill="EDF0F0"/>
             <w:tcBorders>
               <w:top w:val="single" w:sz="4" w:color="D9D9D9"/>
               <w:left w:val="single" w:sz="4" w:color="D9D9D9"/>
@@ -117,10 +211,16 @@
             </w:tcBorders>
           </w:tcPr>
           <w:p>
+            <w:pPr>
+              <w:spacing w:before="0" w:after="0" w:line="276" w:lineRule="auto"/>
+              <w:jc w:val="right"/>
+            </w:pPr>
             <w:r>
               <w:rPr>
+                <w:rFonts w:ascii="Segoe UI" w:hAnsi="Segoe UI"/>
                 <w:b/>
-                <w:color w:val="FFFFFF"/>
+                <w:color w:val="000000"/>
+                <w:sz w:val="22"/>
               </w:rPr>
               <w:t>Bestellmenge</w:t>
             </w:r>
@@ -128,9 +228,20 @@
         </w:tc>
       </w:tr>
       <w:tr>
+        <w:trPr>
+          <w:cantSplit/>
+        </w:trPr>
         <w:tc>
           <w:tcPr>
-            <w:tcW w:type="dxa" w:w="2340"/>
+            <w:tcW w:type="dxa" w:w="2211"/>
+            <w:vAlign w:val="center"/>
+            <w:tcMar>
+              <w:top w:w="90" w:type="dxa"/>
+              <w:bottom w:w="90" w:type="dxa"/>
+              <w:left w:w="110" w:type="dxa"/>
+              <w:right w:w="110" w:type="dxa"/>
+            </w:tcMar>
+            <w:shd w:fill="FFFFFF"/>
             <w:tcBorders>
               <w:top w:val="single" w:sz="4" w:color="D9D9D9"/>
               <w:left w:val="single" w:sz="4" w:color="D9D9D9"/>
@@ -139,14 +250,32 @@
             </w:tcBorders>
           </w:tcPr>
           <w:p>
+            <w:pPr>
+              <w:spacing w:before="0" w:after="0" w:line="276" w:lineRule="auto"/>
+              <w:jc w:val="left"/>
+            </w:pPr>
             <w:r>
+              <w:rPr>
+                <w:rFonts w:ascii="Segoe UI" w:hAnsi="Segoe UI"/>
+                <w:b w:val="0"/>
+                <w:color w:val="000000"/>
+                <w:sz w:val="22"/>
+              </w:rPr>
               <w:t>{{Position.Artikel}}</w:t>
             </w:r>
           </w:p>
         </w:tc>
         <w:tc>
           <w:tcPr>
-            <w:tcW w:type="dxa" w:w="2340"/>
+            <w:tcW w:type="dxa" w:w="2154"/>
+            <w:vAlign w:val="center"/>
+            <w:tcMar>
+              <w:top w:w="90" w:type="dxa"/>
+              <w:bottom w:w="90" w:type="dxa"/>
+              <w:left w:w="110" w:type="dxa"/>
+              <w:right w:w="110" w:type="dxa"/>
+            </w:tcMar>
+            <w:shd w:fill="FFFFFF"/>
             <w:tcBorders>
               <w:top w:val="single" w:sz="4" w:color="D9D9D9"/>
               <w:left w:val="single" w:sz="4" w:color="D9D9D9"/>
@@ -155,14 +284,32 @@
             </w:tcBorders>
           </w:tcPr>
           <w:p>
+            <w:pPr>
+              <w:spacing w:before="0" w:after="0" w:line="276" w:lineRule="auto"/>
+              <w:jc w:val="right"/>
+            </w:pPr>
             <w:r>
+              <w:rPr>
+                <w:rFonts w:ascii="Segoe UI" w:hAnsi="Segoe UI"/>
+                <w:b w:val="0"/>
+                <w:color w:val="000000"/>
+                <w:sz w:val="22"/>
+              </w:rPr>
               <w:t>{{Position.Bestand}}</w:t>
             </w:r>
           </w:p>
         </w:tc>
         <w:tc>
           <w:tcPr>
-            <w:tcW w:type="dxa" w:w="2340"/>
+            <w:tcW w:type="dxa" w:w="2551"/>
+            <w:vAlign w:val="center"/>
+            <w:tcMar>
+              <w:top w:w="90" w:type="dxa"/>
+              <w:bottom w:w="90" w:type="dxa"/>
+              <w:left w:w="110" w:type="dxa"/>
+              <w:right w:w="110" w:type="dxa"/>
+            </w:tcMar>
+            <w:shd w:fill="FFFFFF"/>
             <w:tcBorders>
               <w:top w:val="single" w:sz="4" w:color="D9D9D9"/>
               <w:left w:val="single" w:sz="4" w:color="D9D9D9"/>
@@ -171,14 +318,32 @@
             </w:tcBorders>
           </w:tcPr>
           <w:p>
+            <w:pPr>
+              <w:spacing w:before="0" w:after="0" w:line="276" w:lineRule="auto"/>
+              <w:jc w:val="right"/>
+            </w:pPr>
             <w:r>
+              <w:rPr>
+                <w:rFonts w:ascii="Segoe UI" w:hAnsi="Segoe UI"/>
+                <w:b w:val="0"/>
+                <w:color w:val="000000"/>
+                <w:sz w:val="22"/>
+              </w:rPr>
               <w:t>{{Position.Zielbestand}}</w:t>
             </w:r>
           </w:p>
         </w:tc>
         <w:tc>
           <w:tcPr>
-            <w:tcW w:type="dxa" w:w="2340"/>
+            <w:tcW w:type="dxa" w:w="2721"/>
+            <w:vAlign w:val="center"/>
+            <w:tcMar>
+              <w:top w:w="90" w:type="dxa"/>
+              <w:bottom w:w="90" w:type="dxa"/>
+              <w:left w:w="110" w:type="dxa"/>
+              <w:right w:w="110" w:type="dxa"/>
+            </w:tcMar>
+            <w:shd w:fill="FFFFFF"/>
             <w:tcBorders>
               <w:top w:val="single" w:sz="4" w:color="D9D9D9"/>
               <w:left w:val="single" w:sz="4" w:color="D9D9D9"/>
@@ -187,7 +352,17 @@
             </w:tcBorders>
           </w:tcPr>
           <w:p>
+            <w:pPr>
+              <w:spacing w:before="0" w:after="0" w:line="276" w:lineRule="auto"/>
+              <w:jc w:val="right"/>
+            </w:pPr>
             <w:r>
+              <w:rPr>
+                <w:rFonts w:ascii="Segoe UI" w:hAnsi="Segoe UI"/>
+                <w:b w:val="0"/>
+                <w:color w:val="000000"/>
+                <w:sz w:val="22"/>
+              </w:rPr>
               <w:t>{{Position.Bestellmenge}}</w:t>
             </w:r>
           </w:p>
@@ -195,23 +370,51 @@
       </w:tr>
     </w:tbl>
     <w:p>
+      <w:pPr>
+        <w:keepNext/>
+        <w:spacing w:before="240" w:after="240"/>
+      </w:pPr>
       <w:r>
-        <w:t>Gesamtbestellmenge: {{Gesamtbestellmenge}}</w:t>
+        <w:rPr>
+          <w:b/>
+          <w:sz w:val="24"/>
+        </w:rPr>
+        <w:t>Gesamtbestellmenge: {{Gesamtbestellmenge}} Stück</w:t>
       </w:r>
     </w:p>
     <w:p>
       <w:r>
-        <w:t>Bitte den Vorschlag fachlich prüfen. Dieses Beispiel sendet keine Nachricht und löst keine Bestellung aus.</w:t>
+        <w:t>Synthetisches Beispiel. Bitte den Vorschlag fachlich prüfen. Dieser Ablauf löst keine Bestellung aus.</w:t>
       </w:r>
     </w:p>
     <w:sectPr>
-      <w:pgSz w:w="12240" w:h="15840"/>
-      <w:pgMar w:top="1440" w:right="1440" w:bottom="1440" w:left="1440" w:header="720" w:footer="720" w:gutter="0"/>
+      <w:footerReference w:type="default" r:id="rId9"/>
+      <w:pgSz w:w="11906" w:h="16838"/>
+      <w:pgMar w:top="1134" w:right="1134" w:bottom="1020" w:left="1134" w:header="454" w:footer="454" w:gutter="0"/>
       <w:cols w:space="720"/>
       <w:docGrid w:linePitch="360"/>
     </w:sectPr>
   </w:body>
 </w:document>
+</file>
+
+<file path=word/footer1.xml><?xml version="1.0" encoding="utf-8"?>
+<w:ftr xmlns:m="http://schemas.openxmlformats.org/officeDocument/2006/math" xmlns:mc="http://schemas.openxmlformats.org/markup-compatibility/2006" xmlns:mo="http://schemas.microsoft.com/office/mac/office/2008/main" xmlns:mv="urn:schemas-microsoft-com:mac:vml" xmlns:o="urn:schemas-microsoft-com:office:office" xmlns:r="http://schemas.openxmlformats.org/officeDocument/2006/relationships" xmlns:v="urn:schemas-microsoft-com:vml" xmlns:w10="urn:schemas-microsoft-com:office:word" xmlns:w14="http://schemas.microsoft.com/office/word/2010/wordml" xmlns:w="http://schemas.openxmlformats.org/wordprocessingml/2006/main" xmlns:wne="http://schemas.microsoft.com/office/word/2006/wordml" xmlns:wp14="http://schemas.microsoft.com/office/word/2010/wordprocessingDrawing" xmlns:wp="http://schemas.openxmlformats.org/drawingml/2006/wordprocessingDrawing" xmlns:wpc="http://schemas.microsoft.com/office/word/2010/wordprocessingCanvas" xmlns:wpg="http://schemas.microsoft.com/office/word/2010/wordprocessingGroup" xmlns:wpi="http://schemas.microsoft.com/office/word/2010/wordprocessingInk" xmlns:wps="http://schemas.microsoft.com/office/word/2010/wordprocessingShape" mc:Ignorable="w14 wp14">
+  <w:p>
+    <w:pPr>
+      <w:pStyle w:val="Footer"/>
+      <w:jc w:val="right"/>
+    </w:pPr>
+    <w:r>
+      <w:rPr>
+        <w:rFonts w:ascii="Segoe UI" w:hAnsi="Segoe UI"/>
+        <w:sz w:val="18"/>
+      </w:rPr>
+      <w:t xml:space="preserve">Seite </w:t>
+    </w:r>
+    <w:fldSimple w:instr="PAGE"/>
+  </w:p>
+</w:ftr>
 </file>
 
 <file path=word/numbering.xml><?xml version="1.0" encoding="utf-8"?>
@@ -578,12 +781,15 @@
     <w:qFormat/>
     <w:rsid w:val="00FC693F"/>
     <w:pPr>
-      <w:spacing w:after="160"/>
+      <w:spacing w:after="160" w:line="276" w:lineRule="auto"/>
     </w:pPr>
     <w:rPr>
       <w:rFonts w:ascii="Segoe UI" w:hAnsi="Segoe UI"/>
+      <w:b w:val="0"/>
+      <w:color w:val="000000"/>
       <w:sz w:val="22"/>
       <w:u w:val="none"/>
+      <w:lang w:val="de-DE"/>
     </w:rPr>
   </w:style>
   <w:style w:type="paragraph" w:styleId="Header">
@@ -665,16 +871,18 @@
     <w:pPr>
       <w:keepNext/>
       <w:keepLines/>
-      <w:spacing w:before="200" w:after="0"/>
+      <w:spacing w:before="360" w:after="120"/>
       <w:outlineLvl w:val="1"/>
     </w:pPr>
     <w:rPr>
-      <w:rFonts w:asciiTheme="majorHAnsi" w:eastAsiaTheme="majorEastAsia" w:hAnsiTheme="majorHAnsi" w:cstheme="majorBidi"/>
+      <w:rFonts w:asciiTheme="majorHAnsi" w:eastAsiaTheme="majorEastAsia" w:hAnsiTheme="majorHAnsi" w:cstheme="majorBidi" w:ascii="Segoe UI" w:hAnsi="Segoe UI"/>
       <w:b/>
       <w:bCs/>
-      <w:color w:val="4F81BD" w:themeColor="accent1"/>
-      <w:sz w:val="26"/>
+      <w:color w:val="000000"/>
+      <w:sz w:val="24"/>
       <w:szCs w:val="26"/>
+      <w:u w:val="none"/>
+      <w:lang w:val="de-DE"/>
     </w:rPr>
   </w:style>
   <w:style w:type="paragraph" w:styleId="Heading3">
@@ -844,9 +1052,6 @@
     <w:uiPriority w:val="1"/>
     <w:semiHidden/>
     <w:unhideWhenUsed/>
-    <w:rPr>
-      <w:u w:val="none"/>
-    </w:rPr>
   </w:style>
   <w:style w:type="table" w:default="1" w:styleId="TableNormal">
     <w:name w:val="Normal Table"/>
@@ -930,17 +1135,20 @@
     <w:qFormat/>
     <w:rsid w:val="00FC693F"/>
     <w:pPr>
-      <w:spacing w:after="300" w:line="240" w:lineRule="auto"/>
+      <w:keepNext/>
+      <w:spacing w:after="100" w:line="240" w:lineRule="auto"/>
       <w:contextualSpacing/>
     </w:pPr>
     <w:rPr>
       <w:rFonts w:asciiTheme="majorHAnsi" w:eastAsiaTheme="majorEastAsia" w:hAnsiTheme="majorHAnsi" w:cstheme="majorBidi" w:ascii="Segoe UI" w:hAnsi="Segoe UI"/>
+      <w:b w:val="0"/>
       <w:color w:val="000000"/>
       <w:spacing w:val="5"/>
       <w:kern w:val="28"/>
-      <w:sz w:val="44"/>
+      <w:sz w:val="52"/>
       <w:szCs w:val="52"/>
       <w:u w:val="none"/>
+      <w:lang w:val="de-DE"/>
     </w:rPr>
   </w:style>
   <w:style w:type="character" w:customStyle="1" w:styleId="TitleChar">
@@ -950,13 +1158,15 @@
     <w:uiPriority w:val="10"/>
     <w:rsid w:val="00FC693F"/>
     <w:rPr>
-      <w:rFonts w:asciiTheme="majorHAnsi" w:eastAsiaTheme="majorEastAsia" w:hAnsiTheme="majorHAnsi" w:cstheme="majorBidi"/>
-      <w:color w:val="17365D" w:themeColor="text2" w:themeShade="BF"/>
+      <w:rFonts w:asciiTheme="majorHAnsi" w:eastAsiaTheme="majorEastAsia" w:hAnsiTheme="majorHAnsi" w:cstheme="majorBidi" w:ascii="Segoe UI" w:hAnsi="Segoe UI"/>
+      <w:b w:val="0"/>
+      <w:color w:val="000000"/>
       <w:spacing w:val="5"/>
       <w:kern w:val="28"/>
       <w:sz w:val="52"/>
       <w:szCs w:val="52"/>
       <w:u w:val="none"/>
+      <w:lang w:val="de-DE"/>
     </w:rPr>
   </w:style>
   <w:style w:type="paragraph" w:styleId="Subtitle">
@@ -12269,6 +12479,22 @@
         <w:shd w:val="clear" w:color="auto" w:fill="FBCAA2" w:themeFill="accent6" w:themeFillTint="7F"/>
       </w:tcPr>
     </w:tblStylePr>
+  </w:style>
+  <w:style w:type="paragraph" w:customStyle="1" w:styleId="Bestellangaben">
+    <w:name w:val="Bestellangaben"/>
+    <w:basedOn w:val="Normal"/>
+    <w:pPr>
+      <w:keepNext/>
+      <w:spacing w:after="100"/>
+    </w:pPr>
+    <w:rPr>
+      <w:rFonts w:ascii="Segoe UI" w:hAnsi="Segoe UI"/>
+      <w:b w:val="0"/>
+      <w:color w:val="000000"/>
+      <w:sz w:val="22"/>
+      <w:u w:val="none"/>
+      <w:lang w:val="de-DE"/>
+    </w:rPr>
   </w:style>
 </w:styles>
 </file>

</xml_diff>